<commit_message>
Dokumentasikan dua ketidakcocokan spesifikasi dan rapikan rujukan sumber
- Catatan spesifikasi nomor 9 (huruf I kapital) dan nomor 16 (jendela 6 vs 12
  bulan) dicatat di blok komentar SQL, tab Catatan & Asumsi, dan README.
- Tab Catatan & Asumsi kini menjelaskan 21 sel bernilai default pada tab
  data_customer yang dipakai filter SUMPRODUCT tab 7.
- Rujukan sumber pada tab Matrix Report dan footer Catatan & Asumsi tidak lagi
  menunjuk skrip lokal yang tidak ikut dipublikasikan.
- Subjudul tab Demografi diselaraskan dengan notebook: kelompok Tanpa Gelar
  disebut apa adanya, termasuk batas bawah selang yang hanya menyerempet.
</commit_message>
<xml_diff>
--- a/output/SLIK_SQL_Deliverable_A.docx
+++ b/output/SLIK_SQL_Deliverable_A.docx
@@ -2213,6 +2213,149 @@
           <w:color w:val="6A737D"/>
         </w:rPr>
         <w:t xml:space="preserve">--     "tidak ada data", beda dengan 0).</w:t>
+      </w:r>
+    </w:p>
+    <w:p>
+      <w:pPr>
+        <w:pStyle w:val="KodeSQL"/>
+      </w:pPr>
+      <w:r>
+        <w:rPr>
+          <w:color w:val="6A737D"/>
+        </w:rPr>
+        <w:t xml:space="preserve">--</w:t>
+      </w:r>
+    </w:p>
+    <w:p>
+      <w:pPr>
+        <w:pStyle w:val="KodeSQL"/>
+      </w:pPr>
+      <w:r>
+        <w:rPr>
+          <w:color w:val="6A737D"/>
+        </w:rPr>
+        <w:t xml:space="preserve">-- &gt;&gt;&gt; CATATAN ATAS SPESIFIKASI (dua hal yang perlu dinyatakan terbuka) &lt;&lt;&lt;</w:t>
+      </w:r>
+    </w:p>
+    <w:p>
+      <w:pPr>
+        <w:pStyle w:val="KodeSQL"/>
+      </w:pPr>
+      <w:r>
+        <w:rPr>
+          <w:color w:val="6A737D"/>
+        </w:rPr>
+        <w:t xml:space="preserve">--  a. Nomor 9 pada spesifikasi tertulis 'Installment_personal_loan_active_sum'</w:t>
+      </w:r>
+    </w:p>
+    <w:p>
+      <w:pPr>
+        <w:pStyle w:val="KodeSQL"/>
+      </w:pPr>
+      <w:r>
+        <w:rPr>
+          <w:color w:val="6A737D"/>
+        </w:rPr>
+        <w:t xml:space="preserve">--     dengan huruf I kapital, sementara 24 nama kolom lainnya seluruhnya huruf</w:t>
+      </w:r>
+    </w:p>
+    <w:p>
+      <w:pPr>
+        <w:pStyle w:val="KodeSQL"/>
+      </w:pPr>
+      <w:r>
+        <w:rPr>
+          <w:color w:val="6A737D"/>
+        </w:rPr>
+        <w:t xml:space="preserve">--     kecil. Kolom di sini dibuat installment_personal_loan_active_sum agar</w:t>
+      </w:r>
+    </w:p>
+    <w:p>
+      <w:pPr>
+        <w:pStyle w:val="KodeSQL"/>
+      </w:pPr>
+      <w:r>
+        <w:rPr>
+          <w:color w:val="6A737D"/>
+        </w:rPr>
+        <w:t xml:space="preserve">--     penamaannya konsisten dengan 24 kolom lain; nama kolom di BigQuery</w:t>
+      </w:r>
+    </w:p>
+    <w:p>
+      <w:pPr>
+        <w:pStyle w:val="KodeSQL"/>
+      </w:pPr>
+      <w:r>
+        <w:rPr>
+          <w:color w:val="6A737D"/>
+        </w:rPr>
+        <w:t xml:space="preserve">--     bersifat case-insensitive saat dirujuk, jadi SELECT dengan ejaan</w:t>
+      </w:r>
+    </w:p>
+    <w:p>
+      <w:pPr>
+        <w:pStyle w:val="KodeSQL"/>
+      </w:pPr>
+      <w:r>
+        <w:rPr>
+          <w:color w:val="6A737D"/>
+        </w:rPr>
+        <w:t xml:space="preserve">--     spesifikasi tetap berhasil pada tabel ini.</w:t>
+      </w:r>
+    </w:p>
+    <w:p>
+      <w:pPr>
+        <w:pStyle w:val="KodeSQL"/>
+      </w:pPr>
+      <w:r>
+        <w:rPr>
+          <w:color w:val="6A737D"/>
+        </w:rPr>
+        <w:t xml:space="preserve">--  b. Nomor 16 diminta bernama collection_status_allcondition_last_12months_max</w:t>
+      </w:r>
+    </w:p>
+    <w:p>
+      <w:pPr>
+        <w:pStyle w:val="KodeSQL"/>
+      </w:pPr>
+      <w:r>
+        <w:rPr>
+          <w:color w:val="6A737D"/>
+        </w:rPr>
+        <w:t xml:space="preserve">--     tetapi keterangannya berbunyi "... last 6 months", identik dengan</w:t>
+      </w:r>
+    </w:p>
+    <w:p>
+      <w:pPr>
+        <w:pStyle w:val="KodeSQL"/>
+      </w:pPr>
+      <w:r>
+        <w:rPr>
+          <w:color w:val="6A737D"/>
+        </w:rPr>
+        <w:t xml:space="preserve">--     keterangan nomor 15. Yang diikuti adalah nama kolomnya (jendela 12 bulan)</w:t>
+      </w:r>
+    </w:p>
+    <w:p>
+      <w:pPr>
+        <w:pStyle w:val="KodeSQL"/>
+      </w:pPr>
+      <w:r>
+        <w:rPr>
+          <w:color w:val="6A737D"/>
+        </w:rPr>
+        <w:t xml:space="preserve">--     supaya nomor 15 dan 16 memberi informasi berbeda. Bila yang dimaksud</w:t>
+      </w:r>
+    </w:p>
+    <w:p>
+      <w:pPr>
+        <w:pStyle w:val="KodeSQL"/>
+      </w:pPr>
+      <w:r>
+        <w:rPr>
+          <w:color w:val="6A737D"/>
+        </w:rPr>
+        <w:t xml:space="preserve">--     memang 6 bulan, cukup ubah angka 12 menjadi 6 pada CTE hist_agg.</w:t>
       </w:r>
     </w:p>
     <w:p>

</xml_diff>